<commit_message>
docs(manual): usar la caratula oficial de Univalle en el manual de usuario
Logo, facultad, carrera, estudiante, docente y gestion segun el formato de la practica.
</commit_message>
<xml_diff>
--- a/docs/Manual_de_Usuario_LobbyMaster_Univalle.docx
+++ b/docs/Manual_de_Usuario_LobbyMaster_Univalle.docx
@@ -5,82 +5,111 @@
     <w:tbl>
       <w:tblPr>
         <w:tblW w:type="auto" w:w="0"/>
-        <w:jc w:val="center"/>
         <w:tblLayout w:type="fixed"/>
         <w:tblLook w:firstColumn="1" w:firstRow="1" w:lastColumn="0" w:lastRow="0" w:noHBand="0" w:noVBand="1" w:val="04A0"/>
+        <w:tblBorders>
+          <w:top w:val="nil"/>
+          <w:left w:val="nil"/>
+          <w:bottom w:val="nil"/>
+          <w:right w:val="nil"/>
+          <w:insideH w:val="nil"/>
+          <w:insideV w:val="nil"/>
+        </w:tblBorders>
+        <w:tblLayout w:type="fixed"/>
       </w:tblPr>
       <w:tblGrid>
-        <w:gridCol w:w="9406"/>
+        <w:gridCol w:w="2041"/>
+        <w:gridCol w:w="6463"/>
       </w:tblGrid>
       <w:tr>
-        <w:trPr>
-          <w:trHeight w:val="1701" w:hRule="exact"/>
-        </w:trPr>
         <w:tc>
           <w:tcPr>
-            <w:tcW w:type="dxa" w:w="9354"/>
-            <w:shd w:val="clear" w:color="auto" w:fill="8E1347"/>
+            <w:tcW w:type="dxa" w:w="2041"/>
+          </w:tcPr>
+          <w:p>
+            <w:r>
+              <w:drawing>
+                <wp:inline xmlns:a="http://schemas.openxmlformats.org/drawingml/2006/main" xmlns:pic="http://schemas.openxmlformats.org/drawingml/2006/picture">
+                  <wp:extent cx="936000" cy="1115061"/>
+                  <wp:docPr id="1" name="Picture 1"/>
+                  <wp:cNvGraphicFramePr>
+                    <a:graphicFrameLocks noChangeAspect="1"/>
+                  </wp:cNvGraphicFramePr>
+                  <a:graphic>
+                    <a:graphicData uri="http://schemas.openxmlformats.org/drawingml/2006/picture">
+                      <pic:pic>
+                        <pic:nvPicPr>
+                          <pic:cNvPr id="0" name="logo_univalle.jpeg"/>
+                          <pic:cNvPicPr/>
+                        </pic:nvPicPr>
+                        <pic:blipFill>
+                          <a:blip r:embed="rId9"/>
+                          <a:stretch>
+                            <a:fillRect/>
+                          </a:stretch>
+                        </pic:blipFill>
+                        <pic:spPr>
+                          <a:xfrm>
+                            <a:off x="0" y="0"/>
+                            <a:ext cx="936000" cy="1115061"/>
+                          </a:xfrm>
+                          <a:prstGeom prst="rect"/>
+                        </pic:spPr>
+                      </pic:pic>
+                    </a:graphicData>
+                  </a:graphic>
+                </wp:inline>
+              </w:drawing>
+            </w:r>
+          </w:p>
+        </w:tc>
+        <w:tc>
+          <w:tcPr>
+            <w:tcW w:type="dxa" w:w="6463"/>
           </w:tcPr>
           <w:p>
             <w:pPr>
-              <w:spacing w:before="480" w:after="80"/>
+              <w:spacing w:after="60" w:before="0"/>
               <w:jc w:val="center"/>
             </w:pPr>
             <w:r>
               <w:rPr>
+                <w:rFonts w:ascii="Arial" w:hAnsi="Arial" w:eastAsia="Arial"/>
                 <w:b/>
-                <w:color w:val="FFFFFF"/>
-                <w:sz w:val="44"/>
+                <w:color w:val="000000"/>
+                <w:sz w:val="24"/>
               </w:rPr>
               <w:t>UNIVERSIDAD PRIVADA DEL VALLE</w:t>
             </w:r>
           </w:p>
           <w:p>
             <w:pPr>
+              <w:spacing w:after="60" w:before="0"/>
               <w:jc w:val="center"/>
             </w:pPr>
             <w:r>
               <w:rPr>
-                <w:color w:val="F3E3EA"/>
+                <w:rFonts w:ascii="Arial" w:hAnsi="Arial" w:eastAsia="Arial"/>
+                <w:b/>
+                <w:color w:val="000000"/>
                 <w:sz w:val="24"/>
               </w:rPr>
-              <w:t>UNIVALLE · La Paz, Bolivia</w:t>
+              <w:t>FACULTAD DE INFORMÁTICA Y ELECTRÓNICA</w:t>
             </w:r>
           </w:p>
-        </w:tc>
-      </w:tr>
-    </w:tbl>
-    <w:tbl>
-      <w:tblPr>
-        <w:tblW w:type="auto" w:w="0"/>
-        <w:jc w:val="center"/>
-        <w:tblLayout w:type="fixed"/>
-        <w:tblLook w:firstColumn="1" w:firstRow="1" w:lastColumn="0" w:lastRow="0" w:noHBand="0" w:noVBand="1" w:val="04A0"/>
-      </w:tblPr>
-      <w:tblGrid>
-        <w:gridCol w:w="9406"/>
-      </w:tblGrid>
-      <w:tr>
-        <w:trPr>
-          <w:trHeight w:val="567" w:hRule="exact"/>
-        </w:trPr>
-        <w:tc>
-          <w:tcPr>
-            <w:tcW w:type="dxa" w:w="9354"/>
-            <w:shd w:val="clear" w:color="auto" w:fill="F3E3EA"/>
-          </w:tcPr>
           <w:p>
             <w:pPr>
-              <w:spacing w:before="160" w:after="0"/>
+              <w:spacing w:after="200" w:before="0"/>
               <w:jc w:val="center"/>
             </w:pPr>
             <w:r>
               <w:rPr>
+                <w:rFonts w:ascii="Arial" w:hAnsi="Arial" w:eastAsia="Arial"/>
                 <w:b/>
-                <w:color w:val="8E1347"/>
-                <w:sz w:val="22"/>
+                <w:color w:val="000000"/>
+                <w:sz w:val="24"/>
               </w:rPr>
-              <w:t>Carrera de Ingeniería de Sistemas</w:t>
+              <w:t>INGENIERÍA DE SISTEMAS INFORMÁTICOS</w:t>
             </w:r>
           </w:p>
         </w:tc>
@@ -88,91 +117,22 @@
     </w:tbl>
     <w:p>
       <w:pPr>
-        <w:spacing w:after="0" w:before="0" w:line="1400" w:lineRule="exact"/>
+        <w:spacing w:after="0" w:before="0"/>
       </w:pPr>
-      <w:r>
-        <w:rPr>
-          <w:sz w:val="140"/>
-        </w:rPr>
-      </w:r>
-    </w:p>
-    <w:p>
-      <w:pPr>
-        <w:jc w:val="center"/>
-        <w:pBdr>
-          <w:bottom w:val="single" w:sz="18" w:space="4" w:color="8E1347"/>
-        </w:pBdr>
-      </w:pPr>
-      <w:r>
-        <w:rPr>
-          <w:b/>
-          <w:color w:val="8E1347"/>
-          <w:sz w:val="68"/>
-        </w:rPr>
-        <w:t>MANUAL DE USUARIO</w:t>
-      </w:r>
-    </w:p>
-    <w:p>
-      <w:pPr>
-        <w:spacing w:before="200"/>
-        <w:jc w:val="center"/>
-      </w:pPr>
-      <w:r>
-        <w:rPr>
-          <w:b/>
-          <w:color w:val="222222"/>
-          <w:sz w:val="56"/>
-        </w:rPr>
-        <w:t>LobbyMaster</w:t>
-      </w:r>
-    </w:p>
-    <w:p>
-      <w:pPr>
-        <w:jc w:val="center"/>
-      </w:pPr>
-      <w:r>
-        <w:rPr>
-          <w:color w:val="5B6570"/>
-          <w:sz w:val="28"/>
-        </w:rPr>
-        <w:t>Plataforma web para la organización de torneos de eSports</w:t>
-      </w:r>
-    </w:p>
-    <w:p>
-      <w:pPr>
-        <w:jc w:val="center"/>
-      </w:pPr>
-      <w:r>
-        <w:rPr>
-          <w:color w:val="5B6570"/>
-          <w:sz w:val="22"/>
-        </w:rPr>
-        <w:t>Versión 0.4.0 (Beta 4) · Base de datos en Supabase · Mapa y Google Maps</w:t>
-      </w:r>
-    </w:p>
-    <w:p>
-      <w:pPr>
-        <w:spacing w:after="0" w:before="0" w:line="1400" w:lineRule="exact"/>
-      </w:pPr>
-      <w:r>
-        <w:rPr>
-          <w:sz w:val="140"/>
-        </w:rPr>
-      </w:r>
     </w:p>
     <w:tbl>
       <w:tblPr>
         <w:tblW w:type="auto" w:w="0"/>
-        <w:jc w:val="center"/>
+        <w:jc w:val="right"/>
         <w:tblLayout w:type="fixed"/>
         <w:tblLook w:firstColumn="1" w:firstRow="1" w:lastColumn="0" w:lastRow="0" w:noHBand="0" w:noVBand="1" w:val="04A0"/>
         <w:tblBorders>
-          <w:top w:val="single" w:sz="4" w:space="0" w:color="D9C2CC"/>
-          <w:left w:val="single" w:sz="4" w:space="0" w:color="D9C2CC"/>
-          <w:bottom w:val="single" w:sz="4" w:space="0" w:color="D9C2CC"/>
-          <w:right w:val="single" w:sz="4" w:space="0" w:color="D9C2CC"/>
-          <w:insideH w:val="single" w:sz="4" w:space="0" w:color="D9C2CC"/>
-          <w:insideV w:val="single" w:sz="4" w:space="0" w:color="D9C2CC"/>
+          <w:top w:val="single" w:sz="4" w:space="0" w:color="000000"/>
+          <w:left w:val="single" w:sz="4" w:space="0" w:color="000000"/>
+          <w:bottom w:val="single" w:sz="4" w:space="0" w:color="000000"/>
+          <w:right w:val="single" w:sz="4" w:space="0" w:color="000000"/>
+          <w:insideH w:val="single" w:sz="4" w:space="0" w:color="000000"/>
+          <w:insideV w:val="single" w:sz="4" w:space="0" w:color="000000"/>
         </w:tblBorders>
         <w:tblCellMar>
           <w:top w:w="70" w:type="dxa"/>
@@ -182,233 +142,182 @@
         </w:tblCellMar>
       </w:tblPr>
       <w:tblGrid>
-        <w:gridCol w:w="4703"/>
-        <w:gridCol w:w="4703"/>
+        <w:gridCol w:w="2041"/>
       </w:tblGrid>
       <w:tr>
         <w:tc>
           <w:tcPr>
-            <w:tcW w:type="dxa" w:w="2835"/>
-            <w:shd w:val="clear" w:color="auto" w:fill="8E1347"/>
+            <w:tcW w:type="dxa" w:w="2041"/>
           </w:tcPr>
           <w:p>
             <w:pPr>
               <w:spacing w:after="0"/>
+              <w:jc w:val="center"/>
             </w:pPr>
             <w:r>
               <w:rPr>
+                <w:rFonts w:ascii="Arial" w:hAnsi="Arial"/>
                 <w:b/>
-                <w:color w:val="FFFFFF"/>
-                <w:sz w:val="22"/>
+                <w:sz w:val="20"/>
               </w:rPr>
-              <w:t>Asignatura</w:t>
-            </w:r>
-          </w:p>
-        </w:tc>
-        <w:tc>
-          <w:tcPr>
-            <w:tcW w:type="dxa" w:w="6236"/>
-          </w:tcPr>
-          <w:p>
-            <w:pPr>
-              <w:spacing w:after="0"/>
-            </w:pPr>
-            <w:r>
-              <w:rPr>
-                <w:sz w:val="22"/>
-              </w:rPr>
-              <w:t>Proyecto de Sistemas I</w:t>
-            </w:r>
-          </w:p>
-        </w:tc>
-      </w:tr>
-      <w:tr>
-        <w:tc>
-          <w:tcPr>
-            <w:tcW w:type="dxa" w:w="2835"/>
-            <w:shd w:val="clear" w:color="auto" w:fill="8E1347"/>
-          </w:tcPr>
-          <w:p>
-            <w:pPr>
-              <w:spacing w:after="0"/>
-            </w:pPr>
-            <w:r>
-              <w:rPr>
-                <w:b/>
-                <w:color w:val="FFFFFF"/>
-                <w:sz w:val="22"/>
-              </w:rPr>
-              <w:t>Gestión</w:t>
-            </w:r>
-          </w:p>
-        </w:tc>
-        <w:tc>
-          <w:tcPr>
-            <w:tcW w:type="dxa" w:w="6236"/>
-          </w:tcPr>
-          <w:p>
-            <w:pPr>
-              <w:spacing w:after="0"/>
-            </w:pPr>
-            <w:r>
-              <w:rPr>
-                <w:sz w:val="22"/>
-              </w:rPr>
-              <w:t>2-2026</w:t>
-            </w:r>
-          </w:p>
-        </w:tc>
-      </w:tr>
-      <w:tr>
-        <w:tc>
-          <w:tcPr>
-            <w:tcW w:type="dxa" w:w="2835"/>
-            <w:shd w:val="clear" w:color="auto" w:fill="8E1347"/>
-          </w:tcPr>
-          <w:p>
-            <w:pPr>
-              <w:spacing w:after="0"/>
-            </w:pPr>
-            <w:r>
-              <w:rPr>
-                <w:b/>
-                <w:color w:val="FFFFFF"/>
-                <w:sz w:val="22"/>
-              </w:rPr>
-              <w:t>Metodología</w:t>
-            </w:r>
-          </w:p>
-        </w:tc>
-        <w:tc>
-          <w:tcPr>
-            <w:tcW w:type="dxa" w:w="6236"/>
-          </w:tcPr>
-          <w:p>
-            <w:pPr>
-              <w:spacing w:after="0"/>
-            </w:pPr>
-            <w:r>
-              <w:rPr>
-                <w:sz w:val="22"/>
-              </w:rPr>
-              <w:t>XP (Programación Extrema)</w:t>
-            </w:r>
-          </w:p>
-        </w:tc>
-      </w:tr>
-      <w:tr>
-        <w:tc>
-          <w:tcPr>
-            <w:tcW w:type="dxa" w:w="2835"/>
-            <w:shd w:val="clear" w:color="auto" w:fill="8E1347"/>
-          </w:tcPr>
-          <w:p>
-            <w:pPr>
-              <w:spacing w:after="0"/>
-            </w:pPr>
-            <w:r>
-              <w:rPr>
-                <w:b/>
-                <w:color w:val="FFFFFF"/>
-                <w:sz w:val="22"/>
-              </w:rPr>
-              <w:t>Autor</w:t>
-            </w:r>
-          </w:p>
-        </w:tc>
-        <w:tc>
-          <w:tcPr>
-            <w:tcW w:type="dxa" w:w="6236"/>
-          </w:tcPr>
-          <w:p>
-            <w:pPr>
-              <w:spacing w:after="0"/>
-            </w:pPr>
-            <w:r>
-              <w:rPr>
-                <w:b/>
-                <w:sz w:val="22"/>
-              </w:rPr>
-              <w:t>Yair Anibal Mamani Ticona</w:t>
-            </w:r>
-          </w:p>
-        </w:tc>
-      </w:tr>
-      <w:tr>
-        <w:tc>
-          <w:tcPr>
-            <w:tcW w:type="dxa" w:w="2835"/>
-            <w:shd w:val="clear" w:color="auto" w:fill="8E1347"/>
-          </w:tcPr>
-          <w:p>
-            <w:pPr>
-              <w:spacing w:after="0"/>
-            </w:pPr>
-            <w:r>
-              <w:rPr>
-                <w:b/>
-                <w:color w:val="FFFFFF"/>
-                <w:sz w:val="22"/>
-              </w:rPr>
-              <w:t>Ciudad</w:t>
-            </w:r>
-          </w:p>
-        </w:tc>
-        <w:tc>
-          <w:tcPr>
-            <w:tcW w:type="dxa" w:w="6236"/>
-          </w:tcPr>
-          <w:p>
-            <w:pPr>
-              <w:spacing w:after="0"/>
-            </w:pPr>
-            <w:r>
-              <w:rPr>
-                <w:sz w:val="22"/>
-              </w:rPr>
-              <w:t>La Paz, Bolivia</w:t>
-            </w:r>
-          </w:p>
-        </w:tc>
-      </w:tr>
-      <w:tr>
-        <w:tc>
-          <w:tcPr>
-            <w:tcW w:type="dxa" w:w="2835"/>
-            <w:shd w:val="clear" w:color="auto" w:fill="8E1347"/>
-          </w:tcPr>
-          <w:p>
-            <w:pPr>
-              <w:spacing w:after="0"/>
-            </w:pPr>
-            <w:r>
-              <w:rPr>
-                <w:b/>
-                <w:color w:val="FFFFFF"/>
-                <w:sz w:val="22"/>
-              </w:rPr>
-              <w:t>Fecha</w:t>
-            </w:r>
-          </w:p>
-        </w:tc>
-        <w:tc>
-          <w:tcPr>
-            <w:tcW w:type="dxa" w:w="6236"/>
-          </w:tcPr>
-          <w:p>
-            <w:pPr>
-              <w:spacing w:after="0"/>
-            </w:pPr>
-            <w:r>
-              <w:rPr>
-                <w:sz w:val="22"/>
-              </w:rPr>
-              <w:t>Octubre de 2026</w:t>
+              <w:t>Manual</w:t>
             </w:r>
           </w:p>
         </w:tc>
       </w:tr>
     </w:tbl>
+    <w:p>
+      <w:pPr>
+        <w:spacing w:after="0" w:before="120"/>
+        <w:jc w:val="center"/>
+        <w:pBdr>
+          <w:bottom w:val="single" w:sz="12" w:space="4" w:color="000000"/>
+        </w:pBdr>
+      </w:pPr>
+      <w:r>
+        <w:rPr>
+          <w:rFonts w:ascii="Arial" w:hAnsi="Arial" w:eastAsia="Arial"/>
+          <w:b/>
+          <w:color w:val="000000"/>
+          <w:sz w:val="8"/>
+        </w:rPr>
+      </w:r>
+    </w:p>
+    <w:p>
+      <w:pPr>
+        <w:spacing w:after="800" w:before="480"/>
+        <w:jc w:val="center"/>
+      </w:pPr>
+      <w:r>
+        <w:rPr>
+          <w:rFonts w:ascii="Arial" w:hAnsi="Arial" w:eastAsia="Arial"/>
+          <w:b/>
+          <w:color w:val="000000"/>
+          <w:sz w:val="48"/>
+        </w:rPr>
+        <w:t>PROYECTO DE SISTEMAS I</w:t>
+      </w:r>
+    </w:p>
+    <w:p>
+      <w:pPr>
+        <w:spacing w:after="120" w:before="0"/>
+        <w:jc w:val="center"/>
+      </w:pPr>
+      <w:r>
+        <w:rPr>
+          <w:rFonts w:ascii="Arial" w:hAnsi="Arial" w:eastAsia="Arial"/>
+          <w:b/>
+          <w:color w:val="000000"/>
+          <w:sz w:val="44"/>
+        </w:rPr>
+        <w:t>Manual de usuario</w:t>
+      </w:r>
+    </w:p>
+    <w:p>
+      <w:pPr>
+        <w:spacing w:after="200" w:before="0"/>
+        <w:jc w:val="center"/>
+      </w:pPr>
+      <w:r>
+        <w:rPr>
+          <w:rFonts w:ascii="Arial" w:hAnsi="Arial" w:eastAsia="Arial"/>
+          <w:b/>
+          <w:color w:val="000000"/>
+          <w:sz w:val="60"/>
+        </w:rPr>
+        <w:t>LobbyMaster</w:t>
+      </w:r>
+    </w:p>
+    <w:p>
+      <w:pPr>
+        <w:spacing w:after="80" w:before="0"/>
+        <w:jc w:val="center"/>
+      </w:pPr>
+      <w:r>
+        <w:rPr>
+          <w:rFonts w:ascii="Arial" w:hAnsi="Arial" w:eastAsia="Arial"/>
+          <w:b w:val="0"/>
+          <w:color w:val="000000"/>
+          <w:sz w:val="24"/>
+        </w:rPr>
+        <w:t>Plataforma web para la organización de torneos de eSports</w:t>
+      </w:r>
+    </w:p>
+    <w:p>
+      <w:pPr>
+        <w:spacing w:after="1400" w:before="0"/>
+        <w:jc w:val="center"/>
+      </w:pPr>
+      <w:r>
+        <w:rPr>
+          <w:rFonts w:ascii="Arial" w:hAnsi="Arial" w:eastAsia="Arial"/>
+          <w:b w:val="0"/>
+          <w:color w:val="000000"/>
+          <w:sz w:val="24"/>
+        </w:rPr>
+        <w:t>Versión 0.4.0 (Beta 4)</w:t>
+      </w:r>
+    </w:p>
+    <w:p>
+      <w:pPr>
+        <w:spacing w:after="280" w:before="0"/>
+        <w:jc w:val="center"/>
+      </w:pPr>
+      <w:r>
+        <w:rPr>
+          <w:rFonts w:ascii="Arial" w:hAnsi="Arial" w:eastAsia="Arial"/>
+          <w:b/>
+          <w:color w:val="000000"/>
+          <w:sz w:val="30"/>
+        </w:rPr>
+        <w:t>Estudiante: Mamani Ticona Yair Anibal</w:t>
+      </w:r>
+    </w:p>
+    <w:p>
+      <w:pPr>
+        <w:spacing w:after="1800" w:before="0"/>
+        <w:jc w:val="center"/>
+      </w:pPr>
+      <w:r>
+        <w:rPr>
+          <w:rFonts w:ascii="Arial" w:hAnsi="Arial" w:eastAsia="Arial"/>
+          <w:b/>
+          <w:color w:val="000000"/>
+          <w:sz w:val="30"/>
+        </w:rPr>
+        <w:t>Docente: Lic. Georgina Aruquipa G.</w:t>
+      </w:r>
+    </w:p>
+    <w:p>
+      <w:pPr>
+        <w:spacing w:after="80" w:before="0"/>
+        <w:jc w:val="center"/>
+      </w:pPr>
+      <w:r>
+        <w:rPr>
+          <w:rFonts w:ascii="Arial" w:hAnsi="Arial" w:eastAsia="Arial"/>
+          <w:b/>
+          <w:color w:val="000000"/>
+          <w:sz w:val="22"/>
+        </w:rPr>
+        <w:t>La Paz 27 de octubre de 2026</w:t>
+      </w:r>
+    </w:p>
+    <w:p>
+      <w:pPr>
+        <w:spacing w:after="0" w:before="0"/>
+        <w:jc w:val="center"/>
+      </w:pPr>
+      <w:r>
+        <w:rPr>
+          <w:rFonts w:ascii="Arial" w:hAnsi="Arial" w:eastAsia="Arial"/>
+          <w:b/>
+          <w:color w:val="000000"/>
+          <w:sz w:val="22"/>
+        </w:rPr>
+        <w:t>Gestión II – 2026</w:t>
+      </w:r>
+    </w:p>
     <w:p>
       <w:r>
         <w:br w:type="page"/>
@@ -434,7 +343,7 @@
         <w:spacing w:after="60" w:before="100"/>
         <w:ind w:left="0"/>
         <w:tabs>
-          <w:tab w:val="right" w:leader="dot" w:pos="9355"/>
+          <w:tab w:val="right" w:leader="dot" w:pos="8505"/>
         </w:tabs>
       </w:pPr>
       <w:r>
@@ -459,7 +368,7 @@
         <w:spacing w:after="60" w:before="100"/>
         <w:ind w:left="0"/>
         <w:tabs>
-          <w:tab w:val="right" w:leader="dot" w:pos="9355"/>
+          <w:tab w:val="right" w:leader="dot" w:pos="8505"/>
         </w:tabs>
       </w:pPr>
       <w:r>
@@ -484,7 +393,7 @@
         <w:spacing w:after="60" w:before="100"/>
         <w:ind w:left="0"/>
         <w:tabs>
-          <w:tab w:val="right" w:leader="dot" w:pos="9355"/>
+          <w:tab w:val="right" w:leader="dot" w:pos="8505"/>
         </w:tabs>
       </w:pPr>
       <w:r>
@@ -501,7 +410,7 @@
           <w:sz w:val="22"/>
         </w:rPr>
         <w:tab/>
-        <w:t>4</w:t>
+        <w:t>3</w:t>
       </w:r>
     </w:p>
     <w:p>
@@ -509,7 +418,7 @@
         <w:spacing w:after="20" w:before="0"/>
         <w:ind w:left="454"/>
         <w:tabs>
-          <w:tab w:val="right" w:leader="dot" w:pos="9355"/>
+          <w:tab w:val="right" w:leader="dot" w:pos="8505"/>
         </w:tabs>
       </w:pPr>
       <w:r>
@@ -534,7 +443,7 @@
         <w:spacing w:after="60" w:before="100"/>
         <w:ind w:left="0"/>
         <w:tabs>
-          <w:tab w:val="right" w:leader="dot" w:pos="9355"/>
+          <w:tab w:val="right" w:leader="dot" w:pos="8505"/>
         </w:tabs>
       </w:pPr>
       <w:r>
@@ -551,7 +460,7 @@
           <w:sz w:val="22"/>
         </w:rPr>
         <w:tab/>
-        <w:t>5</w:t>
+        <w:t>4</w:t>
       </w:r>
     </w:p>
     <w:p>
@@ -559,7 +468,7 @@
         <w:spacing w:after="60" w:before="100"/>
         <w:ind w:left="0"/>
         <w:tabs>
-          <w:tab w:val="right" w:leader="dot" w:pos="9355"/>
+          <w:tab w:val="right" w:leader="dot" w:pos="8505"/>
         </w:tabs>
       </w:pPr>
       <w:r>
@@ -576,7 +485,7 @@
           <w:sz w:val="22"/>
         </w:rPr>
         <w:tab/>
-        <w:t>6</w:t>
+        <w:t>5</w:t>
       </w:r>
     </w:p>
     <w:p>
@@ -584,7 +493,7 @@
         <w:spacing w:after="60" w:before="100"/>
         <w:ind w:left="0"/>
         <w:tabs>
-          <w:tab w:val="right" w:leader="dot" w:pos="9355"/>
+          <w:tab w:val="right" w:leader="dot" w:pos="8505"/>
         </w:tabs>
       </w:pPr>
       <w:r>
@@ -601,7 +510,7 @@
           <w:sz w:val="22"/>
         </w:rPr>
         <w:tab/>
-        <w:t>6</w:t>
+        <w:t>5</w:t>
       </w:r>
     </w:p>
     <w:p>
@@ -609,7 +518,7 @@
         <w:spacing w:after="20" w:before="0"/>
         <w:ind w:left="454"/>
         <w:tabs>
-          <w:tab w:val="right" w:leader="dot" w:pos="9355"/>
+          <w:tab w:val="right" w:leader="dot" w:pos="8505"/>
         </w:tabs>
       </w:pPr>
       <w:r>
@@ -626,7 +535,7 @@
           <w:sz w:val="21"/>
         </w:rPr>
         <w:tab/>
-        <w:t>6</w:t>
+        <w:t>5</w:t>
       </w:r>
     </w:p>
     <w:p>
@@ -634,7 +543,7 @@
         <w:spacing w:after="20" w:before="0"/>
         <w:ind w:left="454"/>
         <w:tabs>
-          <w:tab w:val="right" w:leader="dot" w:pos="9355"/>
+          <w:tab w:val="right" w:leader="dot" w:pos="8505"/>
         </w:tabs>
       </w:pPr>
       <w:r>
@@ -651,7 +560,7 @@
           <w:sz w:val="21"/>
         </w:rPr>
         <w:tab/>
-        <w:t>7</w:t>
+        <w:t>6</w:t>
       </w:r>
     </w:p>
     <w:p>
@@ -659,7 +568,7 @@
         <w:spacing w:after="20" w:before="0"/>
         <w:ind w:left="454"/>
         <w:tabs>
-          <w:tab w:val="right" w:leader="dot" w:pos="9355"/>
+          <w:tab w:val="right" w:leader="dot" w:pos="8505"/>
         </w:tabs>
       </w:pPr>
       <w:r>
@@ -676,7 +585,7 @@
           <w:sz w:val="21"/>
         </w:rPr>
         <w:tab/>
-        <w:t>8</w:t>
+        <w:t>6</w:t>
       </w:r>
     </w:p>
     <w:p>
@@ -684,7 +593,7 @@
         <w:spacing w:after="60" w:before="100"/>
         <w:ind w:left="0"/>
         <w:tabs>
-          <w:tab w:val="right" w:leader="dot" w:pos="9355"/>
+          <w:tab w:val="right" w:leader="dot" w:pos="8505"/>
         </w:tabs>
       </w:pPr>
       <w:r>
@@ -701,7 +610,7 @@
           <w:sz w:val="22"/>
         </w:rPr>
         <w:tab/>
-        <w:t>8</w:t>
+        <w:t>7</w:t>
       </w:r>
     </w:p>
     <w:p>
@@ -709,7 +618,7 @@
         <w:spacing w:after="20" w:before="0"/>
         <w:ind w:left="454"/>
         <w:tabs>
-          <w:tab w:val="right" w:leader="dot" w:pos="9355"/>
+          <w:tab w:val="right" w:leader="dot" w:pos="8505"/>
         </w:tabs>
       </w:pPr>
       <w:r>
@@ -726,7 +635,7 @@
           <w:sz w:val="21"/>
         </w:rPr>
         <w:tab/>
-        <w:t>8</w:t>
+        <w:t>7</w:t>
       </w:r>
     </w:p>
     <w:p>
@@ -734,7 +643,7 @@
         <w:spacing w:after="20" w:before="0"/>
         <w:ind w:left="454"/>
         <w:tabs>
-          <w:tab w:val="right" w:leader="dot" w:pos="9355"/>
+          <w:tab w:val="right" w:leader="dot" w:pos="8505"/>
         </w:tabs>
       </w:pPr>
       <w:r>
@@ -751,7 +660,7 @@
           <w:sz w:val="21"/>
         </w:rPr>
         <w:tab/>
-        <w:t>9</w:t>
+        <w:t>8</w:t>
       </w:r>
     </w:p>
     <w:p>
@@ -759,7 +668,7 @@
         <w:spacing w:after="20" w:before="0"/>
         <w:ind w:left="454"/>
         <w:tabs>
-          <w:tab w:val="right" w:leader="dot" w:pos="9355"/>
+          <w:tab w:val="right" w:leader="dot" w:pos="8505"/>
         </w:tabs>
       </w:pPr>
       <w:r>
@@ -776,7 +685,7 @@
           <w:sz w:val="21"/>
         </w:rPr>
         <w:tab/>
-        <w:t>9</w:t>
+        <w:t>8</w:t>
       </w:r>
     </w:p>
     <w:p>
@@ -784,7 +693,7 @@
         <w:spacing w:after="20" w:before="0"/>
         <w:ind w:left="454"/>
         <w:tabs>
-          <w:tab w:val="right" w:leader="dot" w:pos="9355"/>
+          <w:tab w:val="right" w:leader="dot" w:pos="8505"/>
         </w:tabs>
       </w:pPr>
       <w:r>
@@ -801,7 +710,7 @@
           <w:sz w:val="21"/>
         </w:rPr>
         <w:tab/>
-        <w:t>10</w:t>
+        <w:t>8</w:t>
       </w:r>
     </w:p>
     <w:p>
@@ -809,7 +718,7 @@
         <w:spacing w:after="20" w:before="0"/>
         <w:ind w:left="454"/>
         <w:tabs>
-          <w:tab w:val="right" w:leader="dot" w:pos="9355"/>
+          <w:tab w:val="right" w:leader="dot" w:pos="8505"/>
         </w:tabs>
       </w:pPr>
       <w:r>
@@ -826,7 +735,7 @@
           <w:sz w:val="21"/>
         </w:rPr>
         <w:tab/>
-        <w:t>11</w:t>
+        <w:t>9</w:t>
       </w:r>
     </w:p>
     <w:p>
@@ -834,7 +743,7 @@
         <w:spacing w:after="60" w:before="100"/>
         <w:ind w:left="0"/>
         <w:tabs>
-          <w:tab w:val="right" w:leader="dot" w:pos="9355"/>
+          <w:tab w:val="right" w:leader="dot" w:pos="8505"/>
         </w:tabs>
       </w:pPr>
       <w:r>
@@ -851,7 +760,7 @@
           <w:sz w:val="22"/>
         </w:rPr>
         <w:tab/>
-        <w:t>11</w:t>
+        <w:t>10</w:t>
       </w:r>
     </w:p>
     <w:p>
@@ -859,7 +768,7 @@
         <w:spacing w:after="60" w:before="100"/>
         <w:ind w:left="0"/>
         <w:tabs>
-          <w:tab w:val="right" w:leader="dot" w:pos="9355"/>
+          <w:tab w:val="right" w:leader="dot" w:pos="8505"/>
         </w:tabs>
       </w:pPr>
       <w:r>
@@ -876,7 +785,7 @@
           <w:sz w:val="22"/>
         </w:rPr>
         <w:tab/>
-        <w:t>12</w:t>
+        <w:t>11</w:t>
       </w:r>
     </w:p>
     <w:p>
@@ -884,7 +793,7 @@
         <w:spacing w:after="60" w:before="100"/>
         <w:ind w:left="0"/>
         <w:tabs>
-          <w:tab w:val="right" w:leader="dot" w:pos="9355"/>
+          <w:tab w:val="right" w:leader="dot" w:pos="8505"/>
         </w:tabs>
       </w:pPr>
       <w:r>
@@ -901,7 +810,7 @@
           <w:sz w:val="22"/>
         </w:rPr>
         <w:tab/>
-        <w:t>15</w:t>
+        <w:t>13</w:t>
       </w:r>
     </w:p>
     <w:p>
@@ -909,7 +818,7 @@
         <w:spacing w:after="60" w:before="100"/>
         <w:ind w:left="0"/>
         <w:tabs>
-          <w:tab w:val="right" w:leader="dot" w:pos="9355"/>
+          <w:tab w:val="right" w:leader="dot" w:pos="8505"/>
         </w:tabs>
       </w:pPr>
       <w:r>
@@ -926,7 +835,7 @@
           <w:sz w:val="22"/>
         </w:rPr>
         <w:tab/>
-        <w:t>15</w:t>
+        <w:t>13</w:t>
       </w:r>
     </w:p>
     <w:p>
@@ -1172,8 +1081,8 @@
         </w:tblCellMar>
       </w:tblPr>
       <w:tblGrid>
-        <w:gridCol w:w="4703"/>
-        <w:gridCol w:w="4703"/>
+        <w:gridCol w:w="4252"/>
+        <w:gridCol w:w="4252"/>
       </w:tblGrid>
       <w:tr>
         <w:trPr>
@@ -1181,7 +1090,7 @@
         </w:trPr>
         <w:tc>
           <w:tcPr>
-            <w:tcW w:type="dxa" w:w="4703"/>
+            <w:tcW w:type="dxa" w:w="4252"/>
             <w:shd w:val="clear" w:color="auto" w:fill="8E1347"/>
           </w:tcPr>
           <w:p>
@@ -1200,7 +1109,7 @@
         </w:tc>
         <w:tc>
           <w:tcPr>
-            <w:tcW w:type="dxa" w:w="4703"/>
+            <w:tcW w:type="dxa" w:w="4252"/>
             <w:shd w:val="clear" w:color="auto" w:fill="8E1347"/>
           </w:tcPr>
           <w:p>
@@ -1224,7 +1133,7 @@
         </w:trPr>
         <w:tc>
           <w:tcPr>
-            <w:tcW w:type="dxa" w:w="4703"/>
+            <w:tcW w:type="dxa" w:w="4252"/>
           </w:tcPr>
           <w:p>
             <w:pPr>
@@ -1247,7 +1156,7 @@
         </w:tc>
         <w:tc>
           <w:tcPr>
-            <w:tcW w:type="dxa" w:w="4703"/>
+            <w:tcW w:type="dxa" w:w="4252"/>
           </w:tcPr>
           <w:p>
             <w:pPr>
@@ -1268,7 +1177,7 @@
         </w:trPr>
         <w:tc>
           <w:tcPr>
-            <w:tcW w:type="dxa" w:w="4703"/>
+            <w:tcW w:type="dxa" w:w="4252"/>
             <w:shd w:val="clear" w:color="auto" w:fill="FAF3F6"/>
           </w:tcPr>
           <w:p>
@@ -1286,7 +1195,7 @@
         </w:tc>
         <w:tc>
           <w:tcPr>
-            <w:tcW w:type="dxa" w:w="4703"/>
+            <w:tcW w:type="dxa" w:w="4252"/>
             <w:shd w:val="clear" w:color="auto" w:fill="FAF3F6"/>
           </w:tcPr>
           <w:p>
@@ -1308,7 +1217,7 @@
         </w:trPr>
         <w:tc>
           <w:tcPr>
-            <w:tcW w:type="dxa" w:w="4703"/>
+            <w:tcW w:type="dxa" w:w="4252"/>
           </w:tcPr>
           <w:p>
             <w:pPr>
@@ -1325,7 +1234,7 @@
         </w:tc>
         <w:tc>
           <w:tcPr>
-            <w:tcW w:type="dxa" w:w="4703"/>
+            <w:tcW w:type="dxa" w:w="4252"/>
           </w:tcPr>
           <w:p>
             <w:pPr>
@@ -1359,12 +1268,12 @@
         </w:tblCellMar>
       </w:tblPr>
       <w:tblGrid>
-        <w:gridCol w:w="9406"/>
+        <w:gridCol w:w="8504"/>
       </w:tblGrid>
       <w:tr>
         <w:tc>
           <w:tcPr>
-            <w:tcW w:type="dxa" w:w="9406"/>
+            <w:tcW w:type="dxa" w:w="8504"/>
             <w:shd w:val="clear" w:color="auto" w:fill="F3E3EA"/>
             <w:tcBorders>
               <w:left w:val="single" w:sz="36" w:color="8E1347"/>
@@ -1432,8 +1341,8 @@
         </w:tblCellMar>
       </w:tblPr>
       <w:tblGrid>
-        <w:gridCol w:w="4703"/>
-        <w:gridCol w:w="4703"/>
+        <w:gridCol w:w="4252"/>
+        <w:gridCol w:w="4252"/>
       </w:tblGrid>
       <w:tr>
         <w:trPr>
@@ -1441,7 +1350,7 @@
         </w:trPr>
         <w:tc>
           <w:tcPr>
-            <w:tcW w:type="dxa" w:w="4703"/>
+            <w:tcW w:type="dxa" w:w="4252"/>
             <w:shd w:val="clear" w:color="auto" w:fill="8E1347"/>
           </w:tcPr>
           <w:p>
@@ -1460,7 +1369,7 @@
         </w:tc>
         <w:tc>
           <w:tcPr>
-            <w:tcW w:type="dxa" w:w="4703"/>
+            <w:tcW w:type="dxa" w:w="4252"/>
             <w:shd w:val="clear" w:color="auto" w:fill="8E1347"/>
           </w:tcPr>
           <w:p>
@@ -1484,7 +1393,7 @@
         </w:trPr>
         <w:tc>
           <w:tcPr>
-            <w:tcW w:type="dxa" w:w="4703"/>
+            <w:tcW w:type="dxa" w:w="4252"/>
           </w:tcPr>
           <w:p>
             <w:pPr>
@@ -1501,7 +1410,7 @@
         </w:tc>
         <w:tc>
           <w:tcPr>
-            <w:tcW w:type="dxa" w:w="4703"/>
+            <w:tcW w:type="dxa" w:w="4252"/>
           </w:tcPr>
           <w:p>
             <w:pPr>
@@ -1522,7 +1431,7 @@
         </w:trPr>
         <w:tc>
           <w:tcPr>
-            <w:tcW w:type="dxa" w:w="4703"/>
+            <w:tcW w:type="dxa" w:w="4252"/>
             <w:shd w:val="clear" w:color="auto" w:fill="FAF3F6"/>
           </w:tcPr>
           <w:p>
@@ -1540,7 +1449,7 @@
         </w:tc>
         <w:tc>
           <w:tcPr>
-            <w:tcW w:type="dxa" w:w="4703"/>
+            <w:tcW w:type="dxa" w:w="4252"/>
             <w:shd w:val="clear" w:color="auto" w:fill="FAF3F6"/>
           </w:tcPr>
           <w:p>
@@ -1575,7 +1484,7 @@
         </w:trPr>
         <w:tc>
           <w:tcPr>
-            <w:tcW w:type="dxa" w:w="4703"/>
+            <w:tcW w:type="dxa" w:w="4252"/>
           </w:tcPr>
           <w:p>
             <w:pPr>
@@ -1592,7 +1501,7 @@
         </w:tc>
         <w:tc>
           <w:tcPr>
-            <w:tcW w:type="dxa" w:w="4703"/>
+            <w:tcW w:type="dxa" w:w="4252"/>
           </w:tcPr>
           <w:p>
             <w:pPr>
@@ -1643,9 +1552,9 @@
         </w:tblCellMar>
       </w:tblPr>
       <w:tblGrid>
-        <w:gridCol w:w="3135"/>
-        <w:gridCol w:w="3135"/>
-        <w:gridCol w:w="3135"/>
+        <w:gridCol w:w="2835"/>
+        <w:gridCol w:w="2835"/>
+        <w:gridCol w:w="2835"/>
       </w:tblGrid>
       <w:tr>
         <w:trPr>
@@ -1653,7 +1562,7 @@
         </w:trPr>
         <w:tc>
           <w:tcPr>
-            <w:tcW w:type="dxa" w:w="3135"/>
+            <w:tcW w:type="dxa" w:w="2835"/>
             <w:shd w:val="clear" w:color="auto" w:fill="8E1347"/>
           </w:tcPr>
           <w:p>
@@ -1672,7 +1581,7 @@
         </w:tc>
         <w:tc>
           <w:tcPr>
-            <w:tcW w:type="dxa" w:w="3135"/>
+            <w:tcW w:type="dxa" w:w="2835"/>
             <w:shd w:val="clear" w:color="auto" w:fill="8E1347"/>
           </w:tcPr>
           <w:p>
@@ -1691,7 +1600,7 @@
         </w:tc>
         <w:tc>
           <w:tcPr>
-            <w:tcW w:type="dxa" w:w="3135"/>
+            <w:tcW w:type="dxa" w:w="2835"/>
             <w:shd w:val="clear" w:color="auto" w:fill="8E1347"/>
           </w:tcPr>
           <w:p>
@@ -1715,7 +1624,7 @@
         </w:trPr>
         <w:tc>
           <w:tcPr>
-            <w:tcW w:type="dxa" w:w="3135"/>
+            <w:tcW w:type="dxa" w:w="2835"/>
           </w:tcPr>
           <w:p>
             <w:pPr>
@@ -1731,7 +1640,7 @@
         </w:tc>
         <w:tc>
           <w:tcPr>
-            <w:tcW w:type="dxa" w:w="3135"/>
+            <w:tcW w:type="dxa" w:w="2835"/>
           </w:tcPr>
           <w:p>
             <w:pPr>
@@ -1749,7 +1658,7 @@
         </w:tc>
         <w:tc>
           <w:tcPr>
-            <w:tcW w:type="dxa" w:w="3135"/>
+            <w:tcW w:type="dxa" w:w="2835"/>
           </w:tcPr>
           <w:p>
             <w:pPr>
@@ -1772,7 +1681,7 @@
         </w:trPr>
         <w:tc>
           <w:tcPr>
-            <w:tcW w:type="dxa" w:w="3135"/>
+            <w:tcW w:type="dxa" w:w="2835"/>
             <w:shd w:val="clear" w:color="auto" w:fill="FAF3F6"/>
           </w:tcPr>
           <w:p>
@@ -1789,7 +1698,7 @@
         </w:tc>
         <w:tc>
           <w:tcPr>
-            <w:tcW w:type="dxa" w:w="3135"/>
+            <w:tcW w:type="dxa" w:w="2835"/>
             <w:shd w:val="clear" w:color="auto" w:fill="FAF3F6"/>
           </w:tcPr>
           <w:p>
@@ -1808,7 +1717,7 @@
         </w:tc>
         <w:tc>
           <w:tcPr>
-            <w:tcW w:type="dxa" w:w="3135"/>
+            <w:tcW w:type="dxa" w:w="2835"/>
             <w:shd w:val="clear" w:color="auto" w:fill="FAF3F6"/>
           </w:tcPr>
           <w:p>
@@ -1832,7 +1741,7 @@
         </w:trPr>
         <w:tc>
           <w:tcPr>
-            <w:tcW w:type="dxa" w:w="3135"/>
+            <w:tcW w:type="dxa" w:w="2835"/>
           </w:tcPr>
           <w:p>
             <w:pPr>
@@ -1848,7 +1757,7 @@
         </w:tc>
         <w:tc>
           <w:tcPr>
-            <w:tcW w:type="dxa" w:w="3135"/>
+            <w:tcW w:type="dxa" w:w="2835"/>
           </w:tcPr>
           <w:p>
             <w:pPr>
@@ -1866,7 +1775,7 @@
         </w:tc>
         <w:tc>
           <w:tcPr>
-            <w:tcW w:type="dxa" w:w="3135"/>
+            <w:tcW w:type="dxa" w:w="2835"/>
           </w:tcPr>
           <w:p>
             <w:pPr>
@@ -1911,8 +1820,8 @@
       <w:r>
         <w:drawing>
           <wp:inline xmlns:a="http://schemas.openxmlformats.org/drawingml/2006/main" xmlns:pic="http://schemas.openxmlformats.org/drawingml/2006/picture">
-            <wp:extent cx="4752000" cy="2970000"/>
-            <wp:docPr id="1" name="Picture 1"/>
+            <wp:extent cx="4536000" cy="2835000"/>
+            <wp:docPr id="2" name="Picture 2"/>
             <wp:cNvGraphicFramePr>
               <a:graphicFrameLocks noChangeAspect="1"/>
             </wp:cNvGraphicFramePr>
@@ -1924,7 +1833,7 @@
                     <pic:cNvPicPr/>
                   </pic:nvPicPr>
                   <pic:blipFill>
-                    <a:blip r:embed="rId11"/>
+                    <a:blip r:embed="rId12"/>
                     <a:stretch>
                       <a:fillRect/>
                     </a:stretch>
@@ -1932,7 +1841,7 @@
                   <pic:spPr>
                     <a:xfrm>
                       <a:off x="0" y="0"/>
-                      <a:ext cx="4752000" cy="2970000"/>
+                      <a:ext cx="4536000" cy="2835000"/>
                     </a:xfrm>
                     <a:prstGeom prst="rect"/>
                     <a:ln w="9525">
@@ -2101,8 +2010,8 @@
       <w:r>
         <w:drawing>
           <wp:inline xmlns:a="http://schemas.openxmlformats.org/drawingml/2006/main" xmlns:pic="http://schemas.openxmlformats.org/drawingml/2006/picture">
-            <wp:extent cx="4752000" cy="2970000"/>
-            <wp:docPr id="2" name="Picture 2"/>
+            <wp:extent cx="4536000" cy="2835000"/>
+            <wp:docPr id="3" name="Picture 3"/>
             <wp:cNvGraphicFramePr>
               <a:graphicFrameLocks noChangeAspect="1"/>
             </wp:cNvGraphicFramePr>
@@ -2114,7 +2023,7 @@
                     <pic:cNvPicPr/>
                   </pic:nvPicPr>
                   <pic:blipFill>
-                    <a:blip r:embed="rId12"/>
+                    <a:blip r:embed="rId13"/>
                     <a:stretch>
                       <a:fillRect/>
                     </a:stretch>
@@ -2122,7 +2031,7 @@
                   <pic:spPr>
                     <a:xfrm>
                       <a:off x="0" y="0"/>
-                      <a:ext cx="4752000" cy="2970000"/>
+                      <a:ext cx="4536000" cy="2835000"/>
                     </a:xfrm>
                     <a:prstGeom prst="rect"/>
                     <a:ln w="9525">
@@ -2299,8 +2208,8 @@
       <w:r>
         <w:drawing>
           <wp:inline xmlns:a="http://schemas.openxmlformats.org/drawingml/2006/main" xmlns:pic="http://schemas.openxmlformats.org/drawingml/2006/picture">
-            <wp:extent cx="4752000" cy="2970000"/>
-            <wp:docPr id="3" name="Picture 3"/>
+            <wp:extent cx="4536000" cy="2835000"/>
+            <wp:docPr id="4" name="Picture 4"/>
             <wp:cNvGraphicFramePr>
               <a:graphicFrameLocks noChangeAspect="1"/>
             </wp:cNvGraphicFramePr>
@@ -2312,7 +2221,7 @@
                     <pic:cNvPicPr/>
                   </pic:nvPicPr>
                   <pic:blipFill>
-                    <a:blip r:embed="rId13"/>
+                    <a:blip r:embed="rId14"/>
                     <a:stretch>
                       <a:fillRect/>
                     </a:stretch>
@@ -2320,7 +2229,7 @@
                   <pic:spPr>
                     <a:xfrm>
                       <a:off x="0" y="0"/>
-                      <a:ext cx="4752000" cy="2970000"/>
+                      <a:ext cx="4536000" cy="2835000"/>
                     </a:xfrm>
                     <a:prstGeom prst="rect"/>
                     <a:ln w="9525">
@@ -2469,8 +2378,8 @@
       <w:r>
         <w:drawing>
           <wp:inline xmlns:a="http://schemas.openxmlformats.org/drawingml/2006/main" xmlns:pic="http://schemas.openxmlformats.org/drawingml/2006/picture">
-            <wp:extent cx="4752000" cy="2970000"/>
-            <wp:docPr id="4" name="Picture 4"/>
+            <wp:extent cx="4536000" cy="2835000"/>
+            <wp:docPr id="5" name="Picture 5"/>
             <wp:cNvGraphicFramePr>
               <a:graphicFrameLocks noChangeAspect="1"/>
             </wp:cNvGraphicFramePr>
@@ -2482,7 +2391,7 @@
                     <pic:cNvPicPr/>
                   </pic:nvPicPr>
                   <pic:blipFill>
-                    <a:blip r:embed="rId14"/>
+                    <a:blip r:embed="rId15"/>
                     <a:stretch>
                       <a:fillRect/>
                     </a:stretch>
@@ -2490,7 +2399,7 @@
                   <pic:spPr>
                     <a:xfrm>
                       <a:off x="0" y="0"/>
-                      <a:ext cx="4752000" cy="2970000"/>
+                      <a:ext cx="4536000" cy="2835000"/>
                     </a:xfrm>
                     <a:prstGeom prst="rect"/>
                     <a:ln w="9525">
@@ -2709,8 +2618,8 @@
       <w:r>
         <w:drawing>
           <wp:inline xmlns:a="http://schemas.openxmlformats.org/drawingml/2006/main" xmlns:pic="http://schemas.openxmlformats.org/drawingml/2006/picture">
-            <wp:extent cx="4752000" cy="2970000"/>
-            <wp:docPr id="5" name="Picture 5"/>
+            <wp:extent cx="4536000" cy="2835000"/>
+            <wp:docPr id="6" name="Picture 6"/>
             <wp:cNvGraphicFramePr>
               <a:graphicFrameLocks noChangeAspect="1"/>
             </wp:cNvGraphicFramePr>
@@ -2722,7 +2631,7 @@
                     <pic:cNvPicPr/>
                   </pic:nvPicPr>
                   <pic:blipFill>
-                    <a:blip r:embed="rId15"/>
+                    <a:blip r:embed="rId16"/>
                     <a:stretch>
                       <a:fillRect/>
                     </a:stretch>
@@ -2730,7 +2639,7 @@
                   <pic:spPr>
                     <a:xfrm>
                       <a:off x="0" y="0"/>
-                      <a:ext cx="4752000" cy="2970000"/>
+                      <a:ext cx="4536000" cy="2835000"/>
                     </a:xfrm>
                     <a:prstGeom prst="rect"/>
                     <a:ln w="9525">
@@ -2769,8 +2678,8 @@
       <w:r>
         <w:drawing>
           <wp:inline xmlns:a="http://schemas.openxmlformats.org/drawingml/2006/main" xmlns:pic="http://schemas.openxmlformats.org/drawingml/2006/picture">
-            <wp:extent cx="4752000" cy="2970000"/>
-            <wp:docPr id="6" name="Picture 6"/>
+            <wp:extent cx="4536000" cy="2835000"/>
+            <wp:docPr id="7" name="Picture 7"/>
             <wp:cNvGraphicFramePr>
               <a:graphicFrameLocks noChangeAspect="1"/>
             </wp:cNvGraphicFramePr>
@@ -2782,7 +2691,7 @@
                     <pic:cNvPicPr/>
                   </pic:nvPicPr>
                   <pic:blipFill>
-                    <a:blip r:embed="rId16"/>
+                    <a:blip r:embed="rId17"/>
                     <a:stretch>
                       <a:fillRect/>
                     </a:stretch>
@@ -2790,7 +2699,7 @@
                   <pic:spPr>
                     <a:xfrm>
                       <a:off x="0" y="0"/>
-                      <a:ext cx="4752000" cy="2970000"/>
+                      <a:ext cx="4536000" cy="2835000"/>
                     </a:xfrm>
                     <a:prstGeom prst="rect"/>
                     <a:ln w="9525">
@@ -2972,8 +2881,8 @@
       <w:r>
         <w:drawing>
           <wp:inline xmlns:a="http://schemas.openxmlformats.org/drawingml/2006/main" xmlns:pic="http://schemas.openxmlformats.org/drawingml/2006/picture">
-            <wp:extent cx="4752000" cy="2970000"/>
-            <wp:docPr id="7" name="Picture 7"/>
+            <wp:extent cx="4536000" cy="2835000"/>
+            <wp:docPr id="8" name="Picture 8"/>
             <wp:cNvGraphicFramePr>
               <a:graphicFrameLocks noChangeAspect="1"/>
             </wp:cNvGraphicFramePr>
@@ -2985,7 +2894,7 @@
                     <pic:cNvPicPr/>
                   </pic:nvPicPr>
                   <pic:blipFill>
-                    <a:blip r:embed="rId17"/>
+                    <a:blip r:embed="rId18"/>
                     <a:stretch>
                       <a:fillRect/>
                     </a:stretch>
@@ -2993,7 +2902,7 @@
                   <pic:spPr>
                     <a:xfrm>
                       <a:off x="0" y="0"/>
-                      <a:ext cx="4752000" cy="2970000"/>
+                      <a:ext cx="4536000" cy="2835000"/>
                     </a:xfrm>
                     <a:prstGeom prst="rect"/>
                     <a:ln w="9525">
@@ -3106,8 +3015,8 @@
       <w:r>
         <w:drawing>
           <wp:inline xmlns:a="http://schemas.openxmlformats.org/drawingml/2006/main" xmlns:pic="http://schemas.openxmlformats.org/drawingml/2006/picture">
-            <wp:extent cx="4752000" cy="2970000"/>
-            <wp:docPr id="8" name="Picture 8"/>
+            <wp:extent cx="4536000" cy="2835000"/>
+            <wp:docPr id="9" name="Picture 9"/>
             <wp:cNvGraphicFramePr>
               <a:graphicFrameLocks noChangeAspect="1"/>
             </wp:cNvGraphicFramePr>
@@ -3119,7 +3028,7 @@
                     <pic:cNvPicPr/>
                   </pic:nvPicPr>
                   <pic:blipFill>
-                    <a:blip r:embed="rId18"/>
+                    <a:blip r:embed="rId19"/>
                     <a:stretch>
                       <a:fillRect/>
                     </a:stretch>
@@ -3127,7 +3036,7 @@
                   <pic:spPr>
                     <a:xfrm>
                       <a:off x="0" y="0"/>
-                      <a:ext cx="4752000" cy="2970000"/>
+                      <a:ext cx="4536000" cy="2835000"/>
                     </a:xfrm>
                     <a:prstGeom prst="rect"/>
                     <a:ln w="9525">
@@ -3188,8 +3097,8 @@
       <w:r>
         <w:drawing>
           <wp:inline xmlns:a="http://schemas.openxmlformats.org/drawingml/2006/main" xmlns:pic="http://schemas.openxmlformats.org/drawingml/2006/picture">
-            <wp:extent cx="4752000" cy="2970000"/>
-            <wp:docPr id="9" name="Picture 9"/>
+            <wp:extent cx="4536000" cy="2835000"/>
+            <wp:docPr id="10" name="Picture 10"/>
             <wp:cNvGraphicFramePr>
               <a:graphicFrameLocks noChangeAspect="1"/>
             </wp:cNvGraphicFramePr>
@@ -3201,7 +3110,7 @@
                     <pic:cNvPicPr/>
                   </pic:nvPicPr>
                   <pic:blipFill>
-                    <a:blip r:embed="rId19"/>
+                    <a:blip r:embed="rId20"/>
                     <a:stretch>
                       <a:fillRect/>
                     </a:stretch>
@@ -3209,7 +3118,7 @@
                   <pic:spPr>
                     <a:xfrm>
                       <a:off x="0" y="0"/>
-                      <a:ext cx="4752000" cy="2970000"/>
+                      <a:ext cx="4536000" cy="2835000"/>
                     </a:xfrm>
                     <a:prstGeom prst="rect"/>
                     <a:ln w="9525">
@@ -3256,8 +3165,8 @@
       <w:r>
         <w:drawing>
           <wp:inline xmlns:a="http://schemas.openxmlformats.org/drawingml/2006/main" xmlns:pic="http://schemas.openxmlformats.org/drawingml/2006/picture">
-            <wp:extent cx="4752000" cy="2970000"/>
-            <wp:docPr id="10" name="Picture 10"/>
+            <wp:extent cx="4536000" cy="2835000"/>
+            <wp:docPr id="11" name="Picture 11"/>
             <wp:cNvGraphicFramePr>
               <a:graphicFrameLocks noChangeAspect="1"/>
             </wp:cNvGraphicFramePr>
@@ -3269,7 +3178,7 @@
                     <pic:cNvPicPr/>
                   </pic:nvPicPr>
                   <pic:blipFill>
-                    <a:blip r:embed="rId20"/>
+                    <a:blip r:embed="rId21"/>
                     <a:stretch>
                       <a:fillRect/>
                     </a:stretch>
@@ -3277,7 +3186,7 @@
                   <pic:spPr>
                     <a:xfrm>
                       <a:off x="0" y="0"/>
-                      <a:ext cx="4752000" cy="2970000"/>
+                      <a:ext cx="4536000" cy="2835000"/>
                     </a:xfrm>
                     <a:prstGeom prst="rect"/>
                     <a:ln w="9525">
@@ -3413,8 +3322,8 @@
       <w:r>
         <w:drawing>
           <wp:inline xmlns:a="http://schemas.openxmlformats.org/drawingml/2006/main" xmlns:pic="http://schemas.openxmlformats.org/drawingml/2006/picture">
-            <wp:extent cx="4752000" cy="2970000"/>
-            <wp:docPr id="11" name="Picture 11"/>
+            <wp:extent cx="4536000" cy="2835000"/>
+            <wp:docPr id="12" name="Picture 12"/>
             <wp:cNvGraphicFramePr>
               <a:graphicFrameLocks noChangeAspect="1"/>
             </wp:cNvGraphicFramePr>
@@ -3426,7 +3335,7 @@
                     <pic:cNvPicPr/>
                   </pic:nvPicPr>
                   <pic:blipFill>
-                    <a:blip r:embed="rId21"/>
+                    <a:blip r:embed="rId22"/>
                     <a:stretch>
                       <a:fillRect/>
                     </a:stretch>
@@ -3434,7 +3343,7 @@
                   <pic:spPr>
                     <a:xfrm>
                       <a:off x="0" y="0"/>
-                      <a:ext cx="4752000" cy="2970000"/>
+                      <a:ext cx="4536000" cy="2835000"/>
                     </a:xfrm>
                     <a:prstGeom prst="rect"/>
                     <a:ln w="9525">
@@ -3486,8 +3395,8 @@
       <w:r>
         <w:drawing>
           <wp:inline xmlns:a="http://schemas.openxmlformats.org/drawingml/2006/main" xmlns:pic="http://schemas.openxmlformats.org/drawingml/2006/picture">
-            <wp:extent cx="4752000" cy="2970000"/>
-            <wp:docPr id="12" name="Picture 12"/>
+            <wp:extent cx="4536000" cy="2835000"/>
+            <wp:docPr id="13" name="Picture 13"/>
             <wp:cNvGraphicFramePr>
               <a:graphicFrameLocks noChangeAspect="1"/>
             </wp:cNvGraphicFramePr>
@@ -3499,7 +3408,7 @@
                     <pic:cNvPicPr/>
                   </pic:nvPicPr>
                   <pic:blipFill>
-                    <a:blip r:embed="rId22"/>
+                    <a:blip r:embed="rId23"/>
                     <a:stretch>
                       <a:fillRect/>
                     </a:stretch>
@@ -3507,7 +3416,7 @@
                   <pic:spPr>
                     <a:xfrm>
                       <a:off x="0" y="0"/>
-                      <a:ext cx="4752000" cy="2970000"/>
+                      <a:ext cx="4536000" cy="2835000"/>
                     </a:xfrm>
                     <a:prstGeom prst="rect"/>
                     <a:ln w="9525">
@@ -3755,8 +3664,8 @@
       <w:r>
         <w:drawing>
           <wp:inline xmlns:a="http://schemas.openxmlformats.org/drawingml/2006/main" xmlns:pic="http://schemas.openxmlformats.org/drawingml/2006/picture">
-            <wp:extent cx="4752000" cy="2970000"/>
-            <wp:docPr id="13" name="Picture 13"/>
+            <wp:extent cx="4536000" cy="2835000"/>
+            <wp:docPr id="14" name="Picture 14"/>
             <wp:cNvGraphicFramePr>
               <a:graphicFrameLocks noChangeAspect="1"/>
             </wp:cNvGraphicFramePr>
@@ -3768,7 +3677,7 @@
                     <pic:cNvPicPr/>
                   </pic:nvPicPr>
                   <pic:blipFill>
-                    <a:blip r:embed="rId23"/>
+                    <a:blip r:embed="rId24"/>
                     <a:stretch>
                       <a:fillRect/>
                     </a:stretch>
@@ -3776,7 +3685,7 @@
                   <pic:spPr>
                     <a:xfrm>
                       <a:off x="0" y="0"/>
-                      <a:ext cx="4752000" cy="2970000"/>
+                      <a:ext cx="4536000" cy="2835000"/>
                     </a:xfrm>
                     <a:prstGeom prst="rect"/>
                     <a:ln w="9525">
@@ -3877,8 +3786,8 @@
       <w:r>
         <w:drawing>
           <wp:inline xmlns:a="http://schemas.openxmlformats.org/drawingml/2006/main" xmlns:pic="http://schemas.openxmlformats.org/drawingml/2006/picture">
-            <wp:extent cx="4752000" cy="2970000"/>
-            <wp:docPr id="14" name="Picture 14"/>
+            <wp:extent cx="4536000" cy="2835000"/>
+            <wp:docPr id="15" name="Picture 15"/>
             <wp:cNvGraphicFramePr>
               <a:graphicFrameLocks noChangeAspect="1"/>
             </wp:cNvGraphicFramePr>
@@ -3890,7 +3799,7 @@
                     <pic:cNvPicPr/>
                   </pic:nvPicPr>
                   <pic:blipFill>
-                    <a:blip r:embed="rId24"/>
+                    <a:blip r:embed="rId25"/>
                     <a:stretch>
                       <a:fillRect/>
                     </a:stretch>
@@ -3898,7 +3807,7 @@
                   <pic:spPr>
                     <a:xfrm>
                       <a:off x="0" y="0"/>
-                      <a:ext cx="4752000" cy="2970000"/>
+                      <a:ext cx="4536000" cy="2835000"/>
                     </a:xfrm>
                     <a:prstGeom prst="rect"/>
                     <a:ln w="9525">
@@ -3963,8 +3872,8 @@
         </w:tblCellMar>
       </w:tblPr>
       <w:tblGrid>
-        <w:gridCol w:w="4703"/>
-        <w:gridCol w:w="4703"/>
+        <w:gridCol w:w="4252"/>
+        <w:gridCol w:w="4252"/>
       </w:tblGrid>
       <w:tr>
         <w:trPr>
@@ -3972,7 +3881,7 @@
         </w:trPr>
         <w:tc>
           <w:tcPr>
-            <w:tcW w:type="dxa" w:w="4703"/>
+            <w:tcW w:type="dxa" w:w="4252"/>
             <w:shd w:val="clear" w:color="auto" w:fill="8E1347"/>
           </w:tcPr>
           <w:p>
@@ -3991,7 +3900,7 @@
         </w:tc>
         <w:tc>
           <w:tcPr>
-            <w:tcW w:type="dxa" w:w="4703"/>
+            <w:tcW w:type="dxa" w:w="4252"/>
             <w:shd w:val="clear" w:color="auto" w:fill="8E1347"/>
           </w:tcPr>
           <w:p>
@@ -4015,7 +3924,7 @@
         </w:trPr>
         <w:tc>
           <w:tcPr>
-            <w:tcW w:type="dxa" w:w="4703"/>
+            <w:tcW w:type="dxa" w:w="4252"/>
           </w:tcPr>
           <w:p>
             <w:pPr>
@@ -4031,7 +3940,7 @@
         </w:tc>
         <w:tc>
           <w:tcPr>
-            <w:tcW w:type="dxa" w:w="4703"/>
+            <w:tcW w:type="dxa" w:w="4252"/>
           </w:tcPr>
           <w:p>
             <w:pPr>
@@ -4052,7 +3961,7 @@
         </w:trPr>
         <w:tc>
           <w:tcPr>
-            <w:tcW w:type="dxa" w:w="4703"/>
+            <w:tcW w:type="dxa" w:w="4252"/>
             <w:shd w:val="clear" w:color="auto" w:fill="FAF3F6"/>
           </w:tcPr>
           <w:p>
@@ -4069,7 +3978,7 @@
         </w:tc>
         <w:tc>
           <w:tcPr>
-            <w:tcW w:type="dxa" w:w="4703"/>
+            <w:tcW w:type="dxa" w:w="4252"/>
             <w:shd w:val="clear" w:color="auto" w:fill="FAF3F6"/>
           </w:tcPr>
           <w:p>
@@ -4104,7 +4013,7 @@
         </w:trPr>
         <w:tc>
           <w:tcPr>
-            <w:tcW w:type="dxa" w:w="4703"/>
+            <w:tcW w:type="dxa" w:w="4252"/>
           </w:tcPr>
           <w:p>
             <w:pPr>
@@ -4120,7 +4029,7 @@
         </w:tc>
         <w:tc>
           <w:tcPr>
-            <w:tcW w:type="dxa" w:w="4703"/>
+            <w:tcW w:type="dxa" w:w="4252"/>
           </w:tcPr>
           <w:p>
             <w:pPr>
@@ -4154,7 +4063,7 @@
         </w:trPr>
         <w:tc>
           <w:tcPr>
-            <w:tcW w:type="dxa" w:w="4703"/>
+            <w:tcW w:type="dxa" w:w="4252"/>
             <w:shd w:val="clear" w:color="auto" w:fill="FAF3F6"/>
           </w:tcPr>
           <w:p>
@@ -4171,7 +4080,7 @@
         </w:tc>
         <w:tc>
           <w:tcPr>
-            <w:tcW w:type="dxa" w:w="4703"/>
+            <w:tcW w:type="dxa" w:w="4252"/>
             <w:shd w:val="clear" w:color="auto" w:fill="FAF3F6"/>
           </w:tcPr>
           <w:p>
@@ -4193,7 +4102,7 @@
         </w:trPr>
         <w:tc>
           <w:tcPr>
-            <w:tcW w:type="dxa" w:w="4703"/>
+            <w:tcW w:type="dxa" w:w="4252"/>
           </w:tcPr>
           <w:p>
             <w:pPr>
@@ -4209,7 +4118,7 @@
         </w:tc>
         <w:tc>
           <w:tcPr>
-            <w:tcW w:type="dxa" w:w="4703"/>
+            <w:tcW w:type="dxa" w:w="4252"/>
           </w:tcPr>
           <w:p>
             <w:pPr>
@@ -4230,7 +4139,7 @@
         </w:trPr>
         <w:tc>
           <w:tcPr>
-            <w:tcW w:type="dxa" w:w="4703"/>
+            <w:tcW w:type="dxa" w:w="4252"/>
             <w:shd w:val="clear" w:color="auto" w:fill="FAF3F6"/>
           </w:tcPr>
           <w:p>
@@ -4247,7 +4156,7 @@
         </w:tc>
         <w:tc>
           <w:tcPr>
-            <w:tcW w:type="dxa" w:w="4703"/>
+            <w:tcW w:type="dxa" w:w="4252"/>
             <w:shd w:val="clear" w:color="auto" w:fill="FAF3F6"/>
           </w:tcPr>
           <w:p>
@@ -4269,7 +4178,7 @@
         </w:trPr>
         <w:tc>
           <w:tcPr>
-            <w:tcW w:type="dxa" w:w="4703"/>
+            <w:tcW w:type="dxa" w:w="4252"/>
           </w:tcPr>
           <w:p>
             <w:pPr>
@@ -4285,7 +4194,7 @@
         </w:tc>
         <w:tc>
           <w:tcPr>
-            <w:tcW w:type="dxa" w:w="4703"/>
+            <w:tcW w:type="dxa" w:w="4252"/>
           </w:tcPr>
           <w:p>
             <w:pPr>
@@ -4356,10 +4265,10 @@
       </w:r>
     </w:p>
     <w:sectPr>
-      <w:headerReference w:type="default" r:id="rId9"/>
-      <w:footerReference w:type="default" r:id="rId10"/>
-      <w:pgSz w:w="12240" w:h="15840"/>
-      <w:pgMar w:top="1417" w:right="1417" w:bottom="1247" w:left="1417" w:header="720" w:footer="720" w:gutter="0"/>
+      <w:headerReference w:type="default" r:id="rId10"/>
+      <w:footerReference w:type="default" r:id="rId11"/>
+      <w:pgSz w:w="11906" w:h="16838"/>
+      <w:pgMar w:top="1417" w:right="1701" w:bottom="1247" w:left="1701" w:header="720" w:footer="720" w:gutter="0"/>
       <w:cols w:space="720"/>
       <w:titlePg/>
       <w:docGrid w:linePitch="360"/>
@@ -4426,6 +4335,11 @@
   <w:p>
     <w:pPr>
       <w:pStyle w:val="Header"/>
+      <w:tabs>
+        <w:tab w:val="clear" w:pos="4680"/>
+        <w:tab w:val="clear" w:pos="9360"/>
+        <w:tab w:val="right" w:pos="8504"/>
+      </w:tabs>
       <w:pBdr>
         <w:bottom w:val="single" w:sz="8" w:space="4" w:color="8E1347"/>
       </w:pBdr>
@@ -4439,7 +4353,6 @@
       <w:t>UNIVALLE · Proyecto de Sistemas I · 2-2026</w:t>
     </w:r>
     <w:r>
-      <w:tab/>
       <w:tab/>
     </w:r>
     <w:r>

</xml_diff>